<commit_message>
Sync: OneDrive → GitHub 同期 (2026-03-18 更新)
改修資料・設計書・構成管理台帳・コスト調査等の最新版を同期

Co-Authored-By: Claude Opus 4.6 <noreply@anthropic.com>
</commit_message>
<xml_diff>
--- a/05_改修資料/KSM_AWS_006_Modification_RDSコスト削減_ja_vi.docx
+++ b/05_改修資料/KSM_AWS_006_Modification_RDSコスト削減_ja_vi.docx
@@ -7474,8 +7474,8 @@
 </file>
 
 <file path=customXml/item1.xml><?xml version="1.0" encoding="utf-8"?>
-<ct:contentTypeSchema xmlns:ct="http://schemas.microsoft.com/office/2006/metadata/contentType" xmlns:ma="http://schemas.microsoft.com/office/2006/metadata/properties/metaAttributes" ct:_="" ma:_="" ma:contentTypeName="Document" ma:contentTypeID="0x0101008AB003DB5A4D644C9FB3BD19B5C7E000" ma:contentTypeVersion="11" ma:contentTypeDescription="Create a new document." ma:contentTypeScope="" ma:versionID="2c3211479268aeb6d058ac20e4430716">
-  <xsd:schema xmlns:xsd="http://www.w3.org/2001/XMLSchema" xmlns:xs="http://www.w3.org/2001/XMLSchema" xmlns:p="http://schemas.microsoft.com/office/2006/metadata/properties" xmlns:ns2="74a0992f-8328-4daf-870b-3d2b13d3e940" xmlns:ns3="4a37abda-15dd-4e37-8275-3b7fb2897b65" targetNamespace="http://schemas.microsoft.com/office/2006/metadata/properties" ma:root="true" ma:fieldsID="d78d1d4c9cad7b16b9dee64e4ff3a833" ns2:_="" ns3:_="">
+<ct:contentTypeSchema xmlns:ct="http://schemas.microsoft.com/office/2006/metadata/contentType" xmlns:ma="http://schemas.microsoft.com/office/2006/metadata/properties/metaAttributes" ct:_="" ma:_="" ma:contentTypeName="ドキュメント" ma:contentTypeID="0x0101008AB003DB5A4D644C9FB3BD19B5C7E000" ma:contentTypeVersion="11" ma:contentTypeDescription="新しいドキュメントを作成します。" ma:contentTypeScope="" ma:versionID="14213891138059eb724b9e737fafccea">
+  <xsd:schema xmlns:xsd="http://www.w3.org/2001/XMLSchema" xmlns:xs="http://www.w3.org/2001/XMLSchema" xmlns:p="http://schemas.microsoft.com/office/2006/metadata/properties" xmlns:ns2="74a0992f-8328-4daf-870b-3d2b13d3e940" xmlns:ns3="4a37abda-15dd-4e37-8275-3b7fb2897b65" targetNamespace="http://schemas.microsoft.com/office/2006/metadata/properties" ma:root="true" ma:fieldsID="c0714e9ec9c019f03b39320eca5a0ecc" ns2:_="" ns3:_="">
     <xsd:import namespace="74a0992f-8328-4daf-870b-3d2b13d3e940"/>
     <xsd:import namespace="4a37abda-15dd-4e37-8275-3b7fb2897b65"/>
     <xsd:element name="properties">
@@ -7539,7 +7539,7 @@
         <xsd:restriction base="dms:Unknown"/>
       </xsd:simpleType>
     </xsd:element>
-    <xsd:element name="lcf76f155ced4ddcb4097134ff3c332f" ma:index="16" nillable="true" ma:taxonomy="true" ma:internalName="lcf76f155ced4ddcb4097134ff3c332f" ma:taxonomyFieldName="MediaServiceImageTags" ma:displayName="Image Tags" ma:readOnly="false" ma:fieldId="{5cf76f15-5ced-4ddc-b409-7134ff3c332f}" ma:taxonomyMulti="true" ma:sspId="e6619b5c-6674-40b7-9c01-33e12ba1bd7c" ma:termSetId="09814cd3-568e-fe90-9814-8d621ff8fb84" ma:anchorId="fba54fb3-c3e1-fe81-a776-ca4b69148c4d" ma:open="true" ma:isKeyword="false">
+    <xsd:element name="lcf76f155ced4ddcb4097134ff3c332f" ma:index="16" nillable="true" ma:taxonomy="true" ma:internalName="lcf76f155ced4ddcb4097134ff3c332f" ma:taxonomyFieldName="MediaServiceImageTags" ma:displayName="画像タグ" ma:readOnly="false" ma:fieldId="{5cf76f15-5ced-4ddc-b409-7134ff3c332f}" ma:taxonomyMulti="true" ma:sspId="e6619b5c-6674-40b7-9c01-33e12ba1bd7c" ma:termSetId="09814cd3-568e-fe90-9814-8d621ff8fb84" ma:anchorId="fba54fb3-c3e1-fe81-a776-ca4b69148c4d" ma:open="true" ma:isKeyword="false">
       <xsd:complexType>
         <xsd:sequence>
           <xsd:element ref="pc:Terms" minOccurs="0" maxOccurs="1"/>
@@ -7578,8 +7578,8 @@
         <xsd:element ref="dc:creator" minOccurs="0" maxOccurs="1"/>
         <xsd:element ref="dcterms:created" minOccurs="0" maxOccurs="1"/>
         <xsd:element ref="dc:identifier" minOccurs="0" maxOccurs="1"/>
-        <xsd:element name="contentType" minOccurs="0" maxOccurs="1" type="xsd:string" ma:index="0" ma:displayName="Content Type"/>
-        <xsd:element ref="dc:title" minOccurs="0" maxOccurs="1" ma:index="4" ma:displayName="Title"/>
+        <xsd:element name="contentType" minOccurs="0" maxOccurs="1" type="xsd:string" ma:index="0" ma:displayName="コンテンツ タイプ"/>
+        <xsd:element ref="dc:title" minOccurs="0" maxOccurs="1" ma:index="4" ma:displayName="タイトル"/>
         <xsd:element ref="dc:subject" minOccurs="0" maxOccurs="1"/>
         <xsd:element ref="dc:description" minOccurs="0" maxOccurs="1"/>
         <xsd:element name="keywords" minOccurs="0" maxOccurs="1" type="xsd:string"/>
@@ -7689,7 +7689,7 @@
 </file>
 
 <file path=customXml/itemProps1.xml><?xml version="1.0" encoding="utf-8"?>
-<ds:datastoreItem xmlns:ds="http://schemas.openxmlformats.org/officeDocument/2006/customXml" ds:itemID="{BE2CA60A-2DFC-4634-A3F6-44449A254AFB}"/>
+<ds:datastoreItem xmlns:ds="http://schemas.openxmlformats.org/officeDocument/2006/customXml" ds:itemID="{6BC879DE-4F43-4946-8DEC-8CA5E9CC1793}"/>
 </file>
 
 <file path=customXml/itemProps2.xml><?xml version="1.0" encoding="utf-8"?>

</xml_diff>